<commit_message>
v4.2: 감시 thread 통합 — ch04~ch06 페이싱 추가 보강
흩어져 있던 감시 비트들을 하나의 thread로 묶어 슬로 미들에
서스펜스 throughline 부여. 캐주얼 리더 이탈 위험 추가 완화.

신규 비트 (2건):
- ch05 정원: Leon과의 대화 중 회양목 사이로 그림자가 한 박자 머물렀다
  사라짐. 셀라가 봤고, 레온의 검자루에 놓인 손가락이 한 번 굳었다 풀림.
  두 사람 다 입에 담지 않음 — 공모된 침묵.
- ch06 시장: 에밀리가 시선을 시선의 끝으로 포착했지만 "이방인 구경하는
  시선들 중 하나"로 분류하고 잊음. "분류가 틀렸다는 것을 알아채는 데는
  며칠이 더 필요했다" — 드라마틱 아이러니로 처리.

3-beat 에스컬레이션 완성:
  ch05 도서관: 발자국 (audible)
  ch05 정원:   그림자 (visible)
  ch06 시장:   시선 (felt)
  ch06 빨래터: 검은 외투 (specific identification)
  ch06 끝:     에밀리 미행 확정

산출물:
- 셀라의_문_베타보완본.docx: 67,694자 (이전 67,277 → +417)

Co-Authored-By: Claude Opus 4.7 (1M context) <noreply@anthropic.com>
</commit_message>
<xml_diff>
--- a/projects/셀라의 문/export/셀라의_문_베타보완본.docx
+++ b/projects/셀라의 문/export/셀라의_문_베타보완본.docx
@@ -28,7 +28,7 @@
           <w:color w:val="999999"/>
           <w:sz w:val="26"/>
         </w:rPr>
-        <w:t>베타리더 시뮬레이션 보완본 v4.1 (페이싱 + 한국 정체성 보강)</w:t>
+        <w:t>베타리더 시뮬레이션 보완본 v4.2 (감시 thread 통합)</w:t>
       </w:r>
     </w:p>
     <w:p>
@@ -2690,7 +2690,29 @@
         <w:rPr>
           <w:sz w:val="22"/>
         </w:rPr>
-        <w:t>그 말이 밤공기 속에 남았다. 벌레 소리 위에 얹혀서, 사라지지 않고 떠 있었다. 셀라는 레온의 얼굴을 보았다. 레온은 셀라를 보지 않고 호수를 보고 있었다. 훈련복이 아닌 평상복 위에 망토를 걸치고 있었고, 가슴판의 별 문양이 달빛에 희미하게 빛났다. 호수 위의 별. 그의 가문의 상징이 호수 위의 별이라는 것이 지금 이 장면과 겹쳤다. 호수 위의 달빛, 가슴 위의 별빛.</w:t>
+        <w:t>그 말이 밤공기 속에 남았다. 벌레 소리 위에 얹혀서, 사라지지 않고 떠 있었다. 셀라는 레온의 얼굴을 보았다. 레온은 셀라를 보지 않고 호수를 보고 있었다.</w:t>
+      </w:r>
+    </w:p>
+    <w:p>
+      <w:pPr>
+        <w:ind w:firstLine="567"/>
+      </w:pPr>
+      <w:r>
+        <w:rPr>
+          <w:sz w:val="22"/>
+        </w:rPr>
+        <w:t>정원 끝, 회양목 사이로 누군가가 한 박자 머물렀다가 사라지는 것이 보였다. 그림자였다. 윤곽이 사람의 모양이었지만 옷의 색은 어둠 속에서 읽히지 않았다. 셀라가 그것을 보았다. 레온은 호수를 보고 있었지만 검자루 가까이에 놓여 있던 손가락 마디가 한 번 굳어졌다 풀렸다. 두 사람 다 그 그림자를 본 것이었다. 두 사람 다 입에 담지 않았다. 그림자가 사라진 자리에는 회양목 잎의 흔들림만 남았고, 그 흔들림도 한 번 뒤에는 멈추었다.</w:t>
+      </w:r>
+    </w:p>
+    <w:p>
+      <w:pPr>
+        <w:ind w:firstLine="567"/>
+      </w:pPr>
+      <w:r>
+        <w:rPr>
+          <w:sz w:val="22"/>
+        </w:rPr>
+        <w:t>훈련복이 아닌 평상복 위에 망토를 걸치고 있었고, 가슴판의 별 문양이 달빛에 희미하게 빛났다. 호수 위의 별. 그의 가문의 상징이 호수 위의 별이라는 것이 지금 이 장면과 겹쳤다. 호수 위의 달빛, 가슴 위의 별빛.</w:t>
       </w:r>
     </w:p>
     <w:p>
@@ -2788,6 +2810,17 @@
           <w:sz w:val="22"/>
         </w:rPr>
         <w:t>에밀리는 거기서 아침을 보냈다. 생선을 파는 아주머니에게 웃으며 말을 걸었다. 아주머니의 손이 비늘을 벗기는 동작이 능숙했고, 에밀리는 그것을 보며 엄지를 치켜세웠다. 빵 가게 아저씨에게는 점퍼 지퍼를 올렸다 내렸다 하며 보여주었다. 지퍼라는 것이 이 세계에는 없었다. 아저씨가 금속 이빨이 맞물리는 것을 보고 눈을 크게 뜨자, 에밀리가 웃었고, 아저씨도 웃었다. 웃음은 번역이 필요 없는 말이었다.</w:t>
+      </w:r>
+    </w:p>
+    <w:p>
+      <w:pPr>
+        <w:ind w:firstLine="567"/>
+      </w:pPr>
+      <w:r>
+        <w:rPr>
+          <w:sz w:val="22"/>
+        </w:rPr>
+        <w:t>한 번, 시장 한쪽 통로 끝에서 누군가가 잠깐 멈춰 서서 에밀리 쪽을 보다가 다시 사라지는 것을 에밀리는 시선의 끝으로 보았다. 시장에는 새로 온 이방인을 구경하는 시선이 일주일 내내 있어 왔다 — 에밀리는 그것을 그런 시선들 중 하나로 분류하고 잊었다. 분류가 틀렸다는 것을 알아채는 데는 며칠이 더 필요했다.</w:t>
       </w:r>
     </w:p>
     <w:p>

</xml_diff>

<commit_message>
v4.3: 최종 proofread — 3건 미세 수정
12챕터 활성 본문 정밀 점검 (기계 점검 + 정독). 핵심 결과:
- 고유명사·인명·문장부호·시제·따옴표 짝·캐릭터 디테일 모두 통과
- 한국어 흔한 오류 패턴 0건
- 단어 중복·과잉 0건

수정 3건:
- ch02: "셀라가 기억하는 한 두 번째였다" → "한, 두 번째였다".
  쉼표 누락으로 "한두 번째"인지 "기억하는 한, 두 번째"인지 의미 모호.
- ch05: "그 흔들림도 한 번 뒤에는 멈추었다" → "한 박자 뒤에는".
  앞 문장 "한 박자 머물렀다가" 와 평행 구조 통일.
- ch08: "들어 본 적 없는 언어가 몸 안에 남아 있다는 것" →
  "쓸 줄 모르는 언어가". 자장가 회상 직후라 "들어 본 적 없는"은
  앞문장과 논리 모순. "쓸 줄 모르는"이 디아스포라 화자의 언어 거리감을
  더 정확히 포착.

산출물:
- 셀라의_문_베타보완본.docx: 67,688자 (이전 67,694 → -6)

Co-Authored-By: Claude Opus 4.7 (1M context) <noreply@anthropic.com>
</commit_message>
<xml_diff>
--- a/projects/셀라의 문/export/셀라의_문_베타보완본.docx
+++ b/projects/셀라의 문/export/셀라의_문_베타보완본.docx
@@ -28,7 +28,7 @@
           <w:color w:val="999999"/>
           <w:sz w:val="26"/>
         </w:rPr>
-        <w:t>베타리더 시뮬레이션 보완본 v4.2 (감시 thread 통합)</w:t>
+        <w:t>최종 베타보완본 v4.3 (proofread 반영)</w:t>
       </w:r>
     </w:p>
     <w:p>
@@ -831,7 +831,7 @@
         <w:rPr>
           <w:sz w:val="22"/>
         </w:rPr>
-        <w:t>"셀, 저거 뭐야." 에밀리의 목소리가 아까와 달랐다. 장난기가 완전히 사라진, 건조하고 낮은 목소리. 목소리 끝이 잘려 있었다. 말을 더 하면 비명이 될 것을 스스로 알고 자른 것이다. 에밀리가 이 톤으로 말하는 것은 드물었다. 진짜 무서울 때만. 열두 살 때 절벽 아래에서 파도에 휩쓸릴 뻔한 이후로, 셀라가 기억하는 한 두 번째였다.</w:t>
+        <w:t>"셀, 저거 뭐야." 에밀리의 목소리가 아까와 달랐다. 장난기가 완전히 사라진, 건조하고 낮은 목소리. 목소리 끝이 잘려 있었다. 말을 더 하면 비명이 될 것을 스스로 알고 자른 것이다. 에밀리가 이 톤으로 말하는 것은 드물었다. 진짜 무서울 때만. 열두 살 때 절벽 아래에서 파도에 휩쓸릴 뻔한 이후로, 셀라가 기억하는 한, 두 번째였다.</w:t>
       </w:r>
     </w:p>
     <w:p>
@@ -2701,7 +2701,7 @@
         <w:rPr>
           <w:sz w:val="22"/>
         </w:rPr>
-        <w:t>정원 끝, 회양목 사이로 누군가가 한 박자 머물렀다가 사라지는 것이 보였다. 그림자였다. 윤곽이 사람의 모양이었지만 옷의 색은 어둠 속에서 읽히지 않았다. 셀라가 그것을 보았다. 레온은 호수를 보고 있었지만 검자루 가까이에 놓여 있던 손가락 마디가 한 번 굳어졌다 풀렸다. 두 사람 다 그 그림자를 본 것이었다. 두 사람 다 입에 담지 않았다. 그림자가 사라진 자리에는 회양목 잎의 흔들림만 남았고, 그 흔들림도 한 번 뒤에는 멈추었다.</w:t>
+        <w:t>정원 끝, 회양목 사이로 누군가가 한 박자 머물렀다가 사라지는 것이 보였다. 그림자였다. 윤곽이 사람의 모양이었지만 옷의 색은 어둠 속에서 읽히지 않았다. 셀라가 그것을 보았다. 레온은 호수를 보고 있었지만 검자루 가까이에 놓여 있던 손가락 마디가 한 번 굳어졌다 풀렸다. 두 사람 다 그 그림자를 본 것이었다. 두 사람 다 입에 담지 않았다. 그림자가 사라진 자리에는 회양목 잎의 흔들림만 남았고, 그 흔들림도 한 박자 뒤에는 멈추었다.</w:t>
       </w:r>
     </w:p>
     <w:p>
@@ -3964,7 +3964,7 @@
         <w:rPr>
           <w:sz w:val="22"/>
         </w:rPr>
-        <w:t>"어젯밤 일을 들었습니다." 말로스가 의자를 당겨 침대 옆에 앉으며 말했다. 의자를 끄는 소리가 나지 않았다. 바닥에서 들어 옮긴 것이다. 소음을 만들지 않는 사람. 목소리가 낮고 부드러웠다. 아버지처럼. 셀라의 아버지가 이런 목소리였는지 기억이 흐릿했다. 열두 살 이후로 직접 들은 적이 없었다. 전화 너머의 소리는 기억이 있었지만, 그것은 기계를 통과한 것이었고, 진짜 목소리는 해마다 조금씩 지워졌다. 하지만 이런 느낌이었을 것이다. 낮고, 따뜻하고, 안심을 주는. 아빠는 셀라가 어렸을 때 한국말로 자장가를 불러 준 적이 있었다. 가사는 거의 잊었지만 후렴 한 소절이 몸 안에 남아 있었다 — 잘 자라 우리 아가. 멜로디만은 사라지지 않고 갈비뼈 안쪽에 들러붙어 있었다. 들어 본 적 없는 언어가 몸 안에 남아 있다는 것은 셀라가 어디에도 완전히 속하지 못하는 또 하나의 이유였다. "힘든 일이었겠지요."</w:t>
+        <w:t>"어젯밤 일을 들었습니다." 말로스가 의자를 당겨 침대 옆에 앉으며 말했다. 의자를 끄는 소리가 나지 않았다. 바닥에서 들어 옮긴 것이다. 소음을 만들지 않는 사람. 목소리가 낮고 부드러웠다. 아버지처럼. 셀라의 아버지가 이런 목소리였는지 기억이 흐릿했다. 열두 살 이후로 직접 들은 적이 없었다. 전화 너머의 소리는 기억이 있었지만, 그것은 기계를 통과한 것이었고, 진짜 목소리는 해마다 조금씩 지워졌다. 하지만 이런 느낌이었을 것이다. 낮고, 따뜻하고, 안심을 주는. 아빠는 셀라가 어렸을 때 한국말로 자장가를 불러 준 적이 있었다. 가사는 거의 잊었지만 후렴 한 소절이 몸 안에 남아 있었다 — 잘 자라 우리 아가. 멜로디만은 사라지지 않고 갈비뼈 안쪽에 들러붙어 있었다. 쓸 줄 모르는 언어가 몸 안에 남아 있다는 것은 셀라가 어디에도 완전히 속하지 못하는 또 하나의 이유였다. "힘든 일이었겠지요."</w:t>
       </w:r>
     </w:p>
     <w:p>

</xml_diff>